<commit_message>
Add display messages to S01, M01 and C01, supported from Agent 1 through the Respondent Bot
</commit_message>
<xml_diff>
--- a/fixtures/qre-samples/C01_chronic_care_patient_journey.docx
+++ b/fixtures/qre-samples/C01_chronic_care_patient_journey.docx
@@ -730,6 +730,129 @@
                 <w:sz w:val="15"/>
               </w:rPr>
               <w:t>Yes; No</w:t>
+            </w:r>
+          </w:p>
+        </w:tc>
+        <w:tc>
+          <w:tcPr>
+            <w:tcW w:type="dxa" w:w="1656"/>
+            <w:tcMar>
+              <w:top w:w="80" w:type="dxa"/>
+              <w:start w:w="120" w:type="dxa"/>
+              <w:bottom w:w="80" w:type="dxa"/>
+              <w:end w:w="120" w:type="dxa"/>
+            </w:tcMar>
+            <w:vAlign w:val="center"/>
+          </w:tcPr>
+          <w:p>
+            <w:pPr>
+              <w:spacing w:after="0" w:line="240" w:lineRule="auto"/>
+            </w:pPr>
+            <w:r>
+              <w:rPr>
+                <w:rFonts w:ascii="Calibri" w:hAnsi="Calibri"/>
+                <w:sz w:val="15"/>
+              </w:rPr>
+              <w:t>Always show</w:t>
+            </w:r>
+          </w:p>
+        </w:tc>
+      </w:tr>
+      <w:tr>
+        <w:tc>
+          <w:tcPr>
+            <w:tcW w:type="dxa" w:w="792"/>
+            <w:tcMar>
+              <w:top w:w="80" w:type="dxa"/>
+              <w:start w:w="120" w:type="dxa"/>
+              <w:bottom w:w="80" w:type="dxa"/>
+              <w:end w:w="120" w:type="dxa"/>
+            </w:tcMar>
+            <w:vAlign w:val="center"/>
+          </w:tcPr>
+          <w:p>
+            <w:pPr>
+              <w:spacing w:after="0" w:line="240" w:lineRule="auto"/>
+            </w:pPr>
+            <w:r>
+              <w:rPr>
+                <w:rFonts w:ascii="Calibri" w:hAnsi="Calibri"/>
+                <w:b/>
+                <w:sz w:val="15"/>
+              </w:rPr>
+              <w:t>DT1</w:t>
+            </w:r>
+          </w:p>
+        </w:tc>
+        <w:tc>
+          <w:tcPr>
+            <w:tcW w:type="dxa" w:w="4320"/>
+            <w:tcMar>
+              <w:top w:w="80" w:type="dxa"/>
+              <w:start w:w="120" w:type="dxa"/>
+              <w:bottom w:w="80" w:type="dxa"/>
+              <w:end w:w="120" w:type="dxa"/>
+            </w:tcMar>
+            <w:vAlign w:val="center"/>
+          </w:tcPr>
+          <w:p>
+            <w:pPr>
+              <w:spacing w:after="0" w:line="240" w:lineRule="auto"/>
+            </w:pPr>
+            <w:r>
+              <w:rPr>
+                <w:rFonts w:ascii="Calibri" w:hAnsi="Calibri"/>
+                <w:sz w:val="15"/>
+              </w:rPr>
+              <w:t>Great, you're eligible for this survey! Next, a few questions about your care experience.</w:t>
+            </w:r>
+          </w:p>
+        </w:tc>
+        <w:tc>
+          <w:tcPr>
+            <w:tcW w:type="dxa" w:w="1224"/>
+            <w:tcMar>
+              <w:top w:w="80" w:type="dxa"/>
+              <w:start w:w="120" w:type="dxa"/>
+              <w:bottom w:w="80" w:type="dxa"/>
+              <w:end w:w="120" w:type="dxa"/>
+            </w:tcMar>
+            <w:vAlign w:val="center"/>
+          </w:tcPr>
+          <w:p>
+            <w:pPr>
+              <w:spacing w:after="0" w:line="240" w:lineRule="auto"/>
+            </w:pPr>
+            <w:r>
+              <w:rPr>
+                <w:rFonts w:ascii="Calibri" w:hAnsi="Calibri"/>
+                <w:sz w:val="15"/>
+              </w:rPr>
+              <w:t>text display</w:t>
+            </w:r>
+          </w:p>
+        </w:tc>
+        <w:tc>
+          <w:tcPr>
+            <w:tcW w:type="dxa" w:w="2232"/>
+            <w:tcMar>
+              <w:top w:w="80" w:type="dxa"/>
+              <w:start w:w="120" w:type="dxa"/>
+              <w:bottom w:w="80" w:type="dxa"/>
+              <w:end w:w="120" w:type="dxa"/>
+            </w:tcMar>
+            <w:vAlign w:val="center"/>
+          </w:tcPr>
+          <w:p>
+            <w:pPr>
+              <w:spacing w:after="0" w:line="240" w:lineRule="auto"/>
+            </w:pPr>
+            <w:r>
+              <w:rPr>
+                <w:rFonts w:ascii="Calibri" w:hAnsi="Calibri"/>
+                <w:sz w:val="15"/>
+              </w:rPr>
+              <w:t>—</w:t>
             </w:r>
           </w:p>
         </w:tc>
@@ -1875,6 +1998,129 @@
               <w:t>Validate: {"scale": ["1 - Very poor", "2 - Poor", "3 - Fair", "4 - Good", "5 - Excellent"], "require_each_row": true}</w:t>
               <w:br/>
               <w:t>Randomize</w:t>
+            </w:r>
+          </w:p>
+        </w:tc>
+      </w:tr>
+      <w:tr>
+        <w:tc>
+          <w:tcPr>
+            <w:tcW w:type="dxa" w:w="792"/>
+            <w:tcMar>
+              <w:top w:w="80" w:type="dxa"/>
+              <w:start w:w="120" w:type="dxa"/>
+              <w:bottom w:w="80" w:type="dxa"/>
+              <w:end w:w="120" w:type="dxa"/>
+            </w:tcMar>
+            <w:vAlign w:val="center"/>
+          </w:tcPr>
+          <w:p>
+            <w:pPr>
+              <w:spacing w:after="0" w:line="240" w:lineRule="auto"/>
+            </w:pPr>
+            <w:r>
+              <w:rPr>
+                <w:rFonts w:ascii="Calibri" w:hAnsi="Calibri"/>
+                <w:b/>
+                <w:sz w:val="15"/>
+              </w:rPr>
+              <w:t>DT2</w:t>
+            </w:r>
+          </w:p>
+        </w:tc>
+        <w:tc>
+          <w:tcPr>
+            <w:tcW w:type="dxa" w:w="4320"/>
+            <w:tcMar>
+              <w:top w:w="80" w:type="dxa"/>
+              <w:start w:w="120" w:type="dxa"/>
+              <w:bottom w:w="80" w:type="dxa"/>
+              <w:end w:w="120" w:type="dxa"/>
+            </w:tcMar>
+            <w:vAlign w:val="center"/>
+          </w:tcPr>
+          <w:p>
+            <w:pPr>
+              <w:spacing w:after="0" w:line="240" w:lineRule="auto"/>
+            </w:pPr>
+            <w:r>
+              <w:rPr>
+                <w:rFonts w:ascii="Calibri" w:hAnsi="Calibri"/>
+                <w:sz w:val="15"/>
+              </w:rPr>
+              <w:t>Thank you for sharing your care experience so far. Next, we'd like to understand a bit about any support you've used and whether you've considered other providers.</w:t>
+            </w:r>
+          </w:p>
+        </w:tc>
+        <w:tc>
+          <w:tcPr>
+            <w:tcW w:type="dxa" w:w="1224"/>
+            <w:tcMar>
+              <w:top w:w="80" w:type="dxa"/>
+              <w:start w:w="120" w:type="dxa"/>
+              <w:bottom w:w="80" w:type="dxa"/>
+              <w:end w:w="120" w:type="dxa"/>
+            </w:tcMar>
+            <w:vAlign w:val="center"/>
+          </w:tcPr>
+          <w:p>
+            <w:pPr>
+              <w:spacing w:after="0" w:line="240" w:lineRule="auto"/>
+            </w:pPr>
+            <w:r>
+              <w:rPr>
+                <w:rFonts w:ascii="Calibri" w:hAnsi="Calibri"/>
+                <w:sz w:val="15"/>
+              </w:rPr>
+              <w:t>text display</w:t>
+            </w:r>
+          </w:p>
+        </w:tc>
+        <w:tc>
+          <w:tcPr>
+            <w:tcW w:type="dxa" w:w="2232"/>
+            <w:tcMar>
+              <w:top w:w="80" w:type="dxa"/>
+              <w:start w:w="120" w:type="dxa"/>
+              <w:bottom w:w="80" w:type="dxa"/>
+              <w:end w:w="120" w:type="dxa"/>
+            </w:tcMar>
+            <w:vAlign w:val="center"/>
+          </w:tcPr>
+          <w:p>
+            <w:pPr>
+              <w:spacing w:after="0" w:line="240" w:lineRule="auto"/>
+            </w:pPr>
+            <w:r>
+              <w:rPr>
+                <w:rFonts w:ascii="Calibri" w:hAnsi="Calibri"/>
+                <w:sz w:val="15"/>
+              </w:rPr>
+              <w:t>—</w:t>
+            </w:r>
+          </w:p>
+        </w:tc>
+        <w:tc>
+          <w:tcPr>
+            <w:tcW w:type="dxa" w:w="1656"/>
+            <w:tcMar>
+              <w:top w:w="80" w:type="dxa"/>
+              <w:start w:w="120" w:type="dxa"/>
+              <w:bottom w:w="80" w:type="dxa"/>
+              <w:end w:w="120" w:type="dxa"/>
+            </w:tcMar>
+            <w:vAlign w:val="center"/>
+          </w:tcPr>
+          <w:p>
+            <w:pPr>
+              <w:spacing w:after="0" w:line="240" w:lineRule="auto"/>
+            </w:pPr>
+            <w:r>
+              <w:rPr>
+                <w:rFonts w:ascii="Calibri" w:hAnsi="Calibri"/>
+                <w:sz w:val="15"/>
+              </w:rPr>
+              <w:t>Always show</w:t>
             </w:r>
           </w:p>
         </w:tc>
@@ -3361,6 +3607,129 @@
                 <w:sz w:val="15"/>
               </w:rPr>
               <w:t>Validate: {"min_length": 5, "max_length": 500}</w:t>
+            </w:r>
+          </w:p>
+        </w:tc>
+      </w:tr>
+      <w:tr>
+        <w:tc>
+          <w:tcPr>
+            <w:tcW w:type="dxa" w:w="792"/>
+            <w:tcMar>
+              <w:top w:w="80" w:type="dxa"/>
+              <w:start w:w="120" w:type="dxa"/>
+              <w:bottom w:w="80" w:type="dxa"/>
+              <w:end w:w="120" w:type="dxa"/>
+            </w:tcMar>
+            <w:vAlign w:val="center"/>
+          </w:tcPr>
+          <w:p>
+            <w:pPr>
+              <w:spacing w:after="0" w:line="240" w:lineRule="auto"/>
+            </w:pPr>
+            <w:r>
+              <w:rPr>
+                <w:rFonts w:ascii="Calibri" w:hAnsi="Calibri"/>
+                <w:b/>
+                <w:sz w:val="15"/>
+              </w:rPr>
+              <w:t>DT3</w:t>
+            </w:r>
+          </w:p>
+        </w:tc>
+        <w:tc>
+          <w:tcPr>
+            <w:tcW w:type="dxa" w:w="4320"/>
+            <w:tcMar>
+              <w:top w:w="80" w:type="dxa"/>
+              <w:start w:w="120" w:type="dxa"/>
+              <w:bottom w:w="80" w:type="dxa"/>
+              <w:end w:w="120" w:type="dxa"/>
+            </w:tcMar>
+            <w:vAlign w:val="center"/>
+          </w:tcPr>
+          <w:p>
+            <w:pPr>
+              <w:spacing w:after="0" w:line="240" w:lineRule="auto"/>
+            </w:pPr>
+            <w:r>
+              <w:rPr>
+                <w:rFonts w:ascii="Calibri" w:hAnsi="Calibri"/>
+                <w:sz w:val="15"/>
+              </w:rPr>
+              <w:t>You're almost done! Thank you for your answers. Just a few last questions about you to finish up.</w:t>
+            </w:r>
+          </w:p>
+        </w:tc>
+        <w:tc>
+          <w:tcPr>
+            <w:tcW w:type="dxa" w:w="1224"/>
+            <w:tcMar>
+              <w:top w:w="80" w:type="dxa"/>
+              <w:start w:w="120" w:type="dxa"/>
+              <w:bottom w:w="80" w:type="dxa"/>
+              <w:end w:w="120" w:type="dxa"/>
+            </w:tcMar>
+            <w:vAlign w:val="center"/>
+          </w:tcPr>
+          <w:p>
+            <w:pPr>
+              <w:spacing w:after="0" w:line="240" w:lineRule="auto"/>
+            </w:pPr>
+            <w:r>
+              <w:rPr>
+                <w:rFonts w:ascii="Calibri" w:hAnsi="Calibri"/>
+                <w:sz w:val="15"/>
+              </w:rPr>
+              <w:t>text display</w:t>
+            </w:r>
+          </w:p>
+        </w:tc>
+        <w:tc>
+          <w:tcPr>
+            <w:tcW w:type="dxa" w:w="2232"/>
+            <w:tcMar>
+              <w:top w:w="80" w:type="dxa"/>
+              <w:start w:w="120" w:type="dxa"/>
+              <w:bottom w:w="80" w:type="dxa"/>
+              <w:end w:w="120" w:type="dxa"/>
+            </w:tcMar>
+            <w:vAlign w:val="center"/>
+          </w:tcPr>
+          <w:p>
+            <w:pPr>
+              <w:spacing w:after="0" w:line="240" w:lineRule="auto"/>
+            </w:pPr>
+            <w:r>
+              <w:rPr>
+                <w:rFonts w:ascii="Calibri" w:hAnsi="Calibri"/>
+                <w:sz w:val="15"/>
+              </w:rPr>
+              <w:t>—</w:t>
+            </w:r>
+          </w:p>
+        </w:tc>
+        <w:tc>
+          <w:tcPr>
+            <w:tcW w:type="dxa" w:w="1656"/>
+            <w:tcMar>
+              <w:top w:w="80" w:type="dxa"/>
+              <w:start w:w="120" w:type="dxa"/>
+              <w:bottom w:w="80" w:type="dxa"/>
+              <w:end w:w="120" w:type="dxa"/>
+            </w:tcMar>
+            <w:vAlign w:val="center"/>
+          </w:tcPr>
+          <w:p>
+            <w:pPr>
+              <w:spacing w:after="0" w:line="240" w:lineRule="auto"/>
+            </w:pPr>
+            <w:r>
+              <w:rPr>
+                <w:rFonts w:ascii="Calibri" w:hAnsi="Calibri"/>
+                <w:sz w:val="15"/>
+              </w:rPr>
+              <w:t>Always show</w:t>
             </w:r>
           </w:p>
         </w:tc>

</xml_diff>